<commit_message>
Integrate secondary transient audit into JEET package
</commit_message>
<xml_diff>
--- a/submission/jeet/Manuscript_Anonymous.docx
+++ b/submission/jeet/Manuscript_Anonymous.docx
@@ -882,6 +882,36 @@
           <w:sz w:val="20"/>
         </w:rPr>
         <w:t>Each three-phase subsystem receives its own target robust alignment and target covariance. The three KAIST source motors and that target subsystem contribute one covariance each to a four-entity Log-Euclidean mean. Window maxima are first formed within each subsystem and then combined by a system maximum; the same system score is used for calibration. The 48 public fault records remained sealed until the protocol, feature parser, all comparator implementations, environment, healthy calibration scores, and thresholds were captured in hash-addressed commits. All 48 files were then downloaded from the official record, verified against a frozen filename/byte-count/MD5 manifest, and processed once over the unchanged [12, 36) s interval. The run yielded a complete 6 fault-turn counts by 8 loads grid (384 system blocks). The chronological reveal log and hash-addressed commits are retained as audit evidence.</w:t>
+      </w:r>
+    </w:p>
+    <w:p>
+      <w:pPr>
+        <w:pStyle w:val="Heading2"/>
+      </w:pPr>
+      <w:r>
+        <w:rPr>
+          <w:rFonts w:ascii="Times New Roman" w:hAnsi="Times New Roman" w:eastAsia="Times New Roman"/>
+          <w:sz w:val="20"/>
+        </w:rPr>
+        <w:t>5.3 Prospectively frozen secondary transient-set audit</w:t>
+      </w:r>
+    </w:p>
+    <w:p>
+      <w:r>
+        <w:rPr>
+          <w:rFonts w:ascii="Times New Roman" w:hAnsi="Times New Roman" w:eastAsia="Times New Roman"/>
+          <w:sz w:val="20"/>
+        </w:rPr>
+        <w:t>A secondary stress test used a public 10 kHz dataset containing 12 records from one 200 W PMSM and nine from one 20 kW PMSM [34]. Every record transitions from prefault operation to an interturn short circuit under steady-state, load-transient, or speed-transient operation; there are no independent healthy-only records. Before loading any signal values, we froze the archive hash, full-record inclusion rule, parser contract, channel whitelist, onset rule, method set, thresholds, and outputs. Only measured alpha-beta current entered the 26-feature score; fault current located onset and electrical speed was retained for quality control only.</w:t>
+      </w:r>
+    </w:p>
+    <w:p>
+      <w:r>
+        <w:rPr>
+          <w:rFonts w:ascii="Times New Roman" w:hAnsi="Times New Roman" w:eastAsia="Times New Roman"/>
+          <w:sz w:val="20"/>
+        </w:rPr>
+        <w:t>The primary endpoint used non-overlapping 0.2 s windows, a 0.2 s prefault guard, and the first 1 s after the frozen causal onset. Within each motor, one complete record was held out while the remaining records were assigned by hash to healthy-reference fitting or calibration. At least 19 calibration windows and at least 80% compatible records per motor were required. Parser incompatibility and failure of this motor-level gate were predeclared reportable outcomes: no record, time interval, or onset could be manually substituted after reveal. Because prefault segments and fault segments occur within the same records, this audit was designated a secondary transient stress test rather than a third independent health-cohort validation.</w:t>
       </w:r>
     </w:p>
     <w:p>
@@ -5446,6 +5476,50 @@
     </w:p>
     <w:p>
       <w:pPr>
+        <w:pStyle w:val="Heading2"/>
+      </w:pPr>
+      <w:r>
+        <w:rPr>
+          <w:rFonts w:ascii="Times New Roman" w:hAnsi="Times New Roman" w:eastAsia="Times New Roman"/>
+          <w:sz w:val="20"/>
+        </w:rPr>
+        <w:t>6.11 Secondary transient-set compatibility and null sensitivity</w:t>
+      </w:r>
+    </w:p>
+    <w:p>
+      <w:r>
+        <w:rPr>
+          <w:rFonts w:ascii="Times New Roman" w:hAnsi="Times New Roman" w:eastAsia="Times New Roman"/>
+          <w:sz w:val="20"/>
+        </w:rPr>
+        <w:t xml:space="preserve">The frozen primary parser attempted all 21 official records and accepted none. The MATLAB </w:t>
+      </w:r>
+      <w:r>
+        <w:rPr>
+          <w:rFonts w:ascii="Courier New" w:hAnsi="Courier New" w:eastAsia="Courier New"/>
+          <w:sz w:val="17"/>
+        </w:rPr>
+        <w:t>timeseries</w:t>
+      </w:r>
+      <w:r>
+        <w:rPr>
+          <w:rFonts w:ascii="Times New Roman" w:hAnsi="Times New Roman" w:eastAsia="Times New Roman"/>
+          <w:sz w:val="20"/>
+        </w:rPr>
+        <w:t xml:space="preserve"> objects contained empty explicit time arrays even though uniform 10 kHz timing was encoded in their metadata, whereas the frozen parser required an explicit monotonic time vector. Consequently, the primary run produced no features, scores, or detector comparison; this is a prospective compatibility failure, not a fault-detection result.</w:t>
+      </w:r>
+    </w:p>
+    <w:p>
+      <w:r>
+        <w:rPr>
+          <w:rFonts w:ascii="Times New Roman" w:hAnsi="Times New Roman" w:eastAsia="Times New Roman"/>
+          <w:sz w:val="20"/>
+        </w:rPr>
+        <w:t>An opt-in post-reveal structural repair reconstructed time only from the stored start, increment, and length metadata without changing signals, features, or onset rules. It made 12/12 records from the 200 W motor and 4/9 from the 20 kW motor compatible. The other five 20 kW onsets overlapped the frozen 0.5 s baseline, so that motor failed the 80% gate (44.44%) and was not selectively reanalyzed. A descriptive leave-one-record-out sensitivity on the single 200 W motor then produced 0/60 alarms in the primary first-second fault windows for every one of 12 detectors, and 0/120 across the full 2 s post-onset horizon. Held-out prefault alarms ranged from 7/176 to 13/176. Proposed produced 8/176 (4.55%) with mean record AUROC 0.541; Target MinCovDet produced 9/176 (5.11%) with AUROC 0.564. With no standalone healthy sessions, zero thresholded detection, and only one analyzed motor, this post-reveal result neither confirms generalization nor identifies positive or negative transfer. Full compatibility, method, and hash tables are reported in Online Resource 1, Section S9.</w:t>
+      </w:r>
+    </w:p>
+    <w:p>
+      <w:pPr>
         <w:pStyle w:val="Heading1"/>
       </w:pPr>
       <w:r>
@@ -5498,7 +5572,7 @@
           <w:rFonts w:ascii="Times New Roman" w:hAnsi="Times New Roman" w:eastAsia="Times New Roman"/>
           <w:sz w:val="20"/>
         </w:rPr>
-        <w:t>Five limitations dominate the claims. First, each KAIST motor has only one unique healthy record, so its calibration and later-time evaluation are not independent sessions. Second, all KAIST machines share manufacturer and fixed operating condition. Third, the KAIST target faults were inspected during development and are exploratory. Fourth, the external 48-record grid comes from one physical dual-three-phase motor; record bootstrap quantifies variability across its recorded conditions, not across a population of motors. Fifth, the external shift is compound, so this experiment cannot causally separate topology, sampling rate, controller, speed, and load effects.</w:t>
+        <w:t>The secondary transient audit adds a different failure mode: a validation can fail before model comparison if file-time semantics or available prefault baselines do not meet the frozen contract. Reconstructing documented implicit time made analysis possible, but it did not restore confirmatory status. The 200 W null sensitivity is consistent with cross-record healthy heterogeneity overwhelming the short post-onset change under these thresholds; because this interpretation followed reveal, it is a design diagnostic rather than evidence for a revised detector.</w:t>
       </w:r>
     </w:p>
     <w:p>
@@ -5507,7 +5581,16 @@
           <w:rFonts w:ascii="Times New Roman" w:hAnsi="Times New Roman" w:eastAsia="Times New Roman"/>
           <w:sz w:val="20"/>
         </w:rPr>
-        <w:t>The next method study should use only healthy data to condition scores on electrical frequency and load, include a target-only MinCovDet primary comparator, harmonize sampling-rate sensitivity, and freeze early-trajectory detection and FAR criteria before evaluation on another unseen motor or independent laboratory. Multiple genuinely independent healthy sessions are required before session-level risk can be estimated.</w:t>
+        <w:t>Six limitations dominate the claims. First, each KAIST motor has only one unique healthy record, so its calibration and later-time evaluation are not independent sessions. Second, all KAIST machines share manufacturer and fixed operating condition. Third, the KAIST target faults were inspected during development and are exploratory. Fourth, the external 48-record grid comes from one physical dual-three-phase motor; record bootstrap quantifies variability across its recorded conditions, not across a population of motors. Fifth, the external shift is compound, so this experiment cannot causally separate topology, sampling rate, controller, speed, and load effects. Sixth, the secondary transient dataset has no independent healthy records; its frozen parser failed, only four of nine 20 kW records passed the repaired baseline gate, and the reported 200 W sensitivity is post-reveal and conditional on one motor.</w:t>
+      </w:r>
+    </w:p>
+    <w:p>
+      <w:r>
+        <w:rPr>
+          <w:rFonts w:ascii="Times New Roman" w:hAnsi="Times New Roman" w:eastAsia="Times New Roman"/>
+          <w:sz w:val="20"/>
+        </w:rPr>
+        <w:t>The next method study should use only healthy data to condition scores on electrical frequency and load, include a target-only MinCovDet primary comparator, harmonize sampling-rate sensitivity, and freeze early-trajectory detection and FAR criteria before evaluation on another unseen motor or independent laboratory. Multiple genuinely independent healthy sessions, documented time semantics, and adequate prefault duration are required before session-level risk can be estimated.</w:t>
       </w:r>
     </w:p>
     <w:p>
@@ -5528,7 +5611,7 @@
           <w:rFonts w:ascii="Times New Roman" w:hAnsi="Times New Roman" w:eastAsia="Times New Roman"/>
           <w:sz w:val="20"/>
         </w:rPr>
-        <w:t>This study demonstrates why healthy-only PMSM fault detection must be evaluated across physical files, motors, operating trajectories, and laboratories rather than adjacent windows. A detector with 95.71% exploratory same-family detection fell to 25.00% after a frozen external reveal, failed its health-risk gate, and was exceeded by a target-only robust covariance comparator at 70.05%. The failure was structured: alarms drifted across ordered blocks in alignment with the acceleration trajectory, detection weakened with load, and source-augmented variants underperformed target-only counterparts on this motor. The contribution is therefore not a claim of a universally superior detector, but a reproducible account of ranking reversal and conditional negative transfer that preserves the frozen primary failure. Reliable deployment requires operating-condition-aware target-health modeling, independent healthy sessions, and a new untouched confirmation; the present evidence does not establish unrestricted machine generalization, severity estimation, prognosis, or a safety guarantee.</w:t>
+        <w:t>This study demonstrates why healthy-only PMSM fault detection must be evaluated across physical files, motors, operating trajectories, and laboratories rather than adjacent windows. A detector with 95.71% exploratory same-family detection fell to 25.00% after a frozen external reveal, failed its health-risk gate, and was exceeded by a target-only robust covariance comparator at 70.05%. The failure was structured: alarms drifted across ordered blocks in alignment with the acceleration trajectory, detection weakened with load, and source-augmented variants underperformed target-only counterparts on this motor. The contribution is therefore not a claim of a universally superior detector, but a reproducible account of ranking reversal and conditional negative transfer that preserves the frozen primary failure. A prospectively logged secondary audit likewise did not supply confirmatory evidence: its primary parser was incompatible with the stored time representation, and all methods missed the first second in the repaired single-motor sensitivity. Reliable deployment requires operating-condition-aware target-health modeling, independent healthy sessions, and a new untouched confirmation; the present evidence does not establish unrestricted machine generalization, severity estimation, prognosis, or a safety guarantee.</w:t>
       </w:r>
     </w:p>
     <w:p>
@@ -5549,7 +5632,7 @@
           <w:rFonts w:ascii="Times New Roman" w:hAnsi="Times New Roman" w:eastAsia="Times New Roman"/>
           <w:sz w:val="20"/>
         </w:rPr>
-        <w:t>The KAIST source dataset is available from Mendeley Data and the independent dual-three-phase PMSM dataset from Zenodo, both under CC BY 4.0 [31, 32]. The project contains resumable checksummed downloads, archive and MAT audits, duplicate removal, feature extraction, motor/file-level evaluation, paired bootstrap, sensitivity analyses, automated tests, and figure generation. Raw data remain excluded from version control; the reveal manifest, protocol, selected derived results, and audit metadata are retained for exact reconstruction. Detailed partitions, thresholds, comparator results, post-reveal diagnostics, sampling-rate controls, and file hashes are provided in Online Resource 1. The anonymized code, automated tests, protocols, and selected derived outputs needed to rerun the reported analyses are provided in Online Resource 2.</w:t>
+        <w:t>The KAIST source dataset is available from Mendeley Data; the independent dual-three-phase PMSM dataset and the secondary 200 W/20 kW transient dataset are available from Zenodo. All three are under CC BY 4.0 [31, 32, 34]. The project contains resumable checksummed downloads, archive and MAT audits, duplicate removal, feature extraction, motor/file-level evaluation, paired bootstrap, sensitivity analyses, automated tests, and figure generation. Raw data remain excluded from version control; the reveal manifests, protocols, selected derived results, and audit metadata are retained for exact reconstruction. Detailed partitions, thresholds, comparator results, post-reveal diagnostics, sampling-rate controls, transient-set compatibility outcomes, and file hashes are provided in Online Resource 1. The anonymized code, automated tests, protocols, and selected derived outputs needed to rerun the reported analyses are provided in Online Resource 2.</w:t>
       </w:r>
     </w:p>
     <w:p>
@@ -6106,6 +6189,19 @@
         <w:t>[33] Kozovský, M., Buchta, L., &amp; Blaha, P. (2022). Interturn Short Circuit Modelling in Dual Three-Phase PMSM. In IECON 2022 - 48th Annual Conference of the IEEE Industrial Electronics Society (pp. 1-6). https://doi.org/10.1109/IECON49645.2022.9968364</w:t>
       </w:r>
     </w:p>
+    <w:p>
+      <w:pPr>
+        <w:spacing w:after="80"/>
+        <w:ind w:left="360" w:hanging="360"/>
+      </w:pPr>
+      <w:r>
+        <w:rPr>
+          <w:rFonts w:ascii="Times New Roman" w:hAnsi="Times New Roman" w:eastAsia="Times New Roman"/>
+          <w:sz w:val="18"/>
+        </w:rPr>
+        <w:t>[34] Zezula, L., Kozovsky, M., &amp; Blaha, P. (2024). Diagnostics of Interturn Short Circuits in PMSMs With Online Fault Indicators Estimation - Dataset [Data set]. Zenodo. https://doi.org/10.5281/zenodo.15631383</w:t>
+      </w:r>
+    </w:p>
     <w:sectPr>
       <w:footerReference w:type="default" r:id="rId9"/>
       <w:pgSz w:w="12240" w:h="15840"/>

</xml_diff>

<commit_message>
Tighten JEET title and acronym compliance
</commit_message>
<xml_diff>
--- a/submission/jeet/Manuscript_Anonymous.docx
+++ b/submission/jeet/Manuscript_Anonymous.docx
@@ -11,7 +11,7 @@
           <w:rFonts w:ascii="Times New Roman" w:hAnsi="Times New Roman" w:eastAsia="Times New Roman"/>
           <w:sz w:val="20"/>
         </w:rPr>
-        <w:t>When Healthy-Only Transfer Fails: A Leakage-Resistant Cross-Dataset Evaluation of PMSM Stator-Fault Detectors under Compound Speed, Load, and Topology Shift</w:t>
+        <w:t>When Healthy-Only Transfer Fails in PMSM Stator-Fault Detection: A Leakage-Resistant Cross-Dataset Evaluation</w:t>
       </w:r>
     </w:p>
     <w:p>
@@ -32,7 +32,7 @@
           <w:rFonts w:ascii="Times New Roman" w:hAnsi="Times New Roman" w:eastAsia="Times New Roman"/>
           <w:sz w:val="20"/>
         </w:rPr>
-        <w:t>High within-dataset accuracy does not establish that a healthy-only stator-fault detector will transfer to a different permanent-magnet synchronous motor (PMSM). We evaluate eleven covariance and one-class detectors across two experimental datasets with motor/file separation, chronological target-health splits, 3 s alarm blocks, and no target-fault labels for fitting or thresholding. An exploratory study used three same-manufacturer 1.0, 1.5, and 3.0 kW PMSMs at fixed speed and load. A motor-balanced Log-Euclidean detector produced 0/42 later-time healthy alarms and 95.71% fault-block detection. A motor-balanced Isolation Forest produced 0/42 and 96.07%, with no resolved difference. We then froze the pipeline and healthy threshold before revealing 48 fault records from one independent dual-three-phase PMSM undergoing acceleration at eight loads. The frozen detector failed its empirical health gate (1/32 alarms; descriptive 95% Wilson upper bound 15.74% versus a 12% limit), detected 25.00% of fault blocks (95% turn-stratified record-bootstrap interval 21.09-29.43%), and attained AUROC 0.635. A target-only Minimum Covariance Determinant comparator instead produced 0/32 healthy alarms, 70.05% detection (65.36-75.26%), and AUROC 0.927. The frozen detector alarmed on none of the 48 records in the first three blocks but on all 48 in the final block; detection also fell from 56.25% at 0 N m to 12.50% at 35 N m. Conditional on this external motor, the results reveal a ranking reversal, acceleration-aligned alarm drift, and source-augmented variants that underperformed target-only counterparts. This audit-first protocol demonstrates why same-dataset scores and record-any alarms can overstate deployability under compound shift.</w:t>
+        <w:t>High within-dataset accuracy does not establish that a healthy-only stator-fault detector will transfer to a different permanent-magnet synchronous motor (PMSM). We evaluate eleven covariance and one-class detectors across two datasets with motor/file separation, chronological target-health splits, 3 s alarm blocks, and no target-fault labels for fitting or thresholding. An exploratory study used three same-manufacturer 1.0, 1.5, and 3.0 kW PMSMs at fixed speed and load. The motor-balanced Log-Euclidean detector produced 0/42 healthy alarms and 95.71% fault-block detection. A motor-balanced Isolation Forest produced 0/42 and 96.07%, without a resolved difference. We froze the pipeline and health threshold before revealing 48 fault records from an independent dual-three-phase PMSM accelerated at eight loads. The frozen detector failed its empirical health gate (1/32 alarms; descriptive 95% Wilson upper confidence bound 15.74% versus a 12% limit), detected 25.00% of fault blocks (95% turn-stratified record-bootstrap interval 21.09-29.43%), and attained an area under the receiver-operating-characteristic curve (AUROC) of 0.635. Target-only Minimum Covariance Determinant produced 0/32 healthy alarms, 70.05% detection (65.36-75.26%), and AUROC 0.927. The frozen detector alarmed on none of 48 records in the first three blocks but on all 48 in the final block; detection also fell from 56.25% at 0 N m to 12.50% at 35 N m. Conditional on this external motor, the results reveal a ranking reversal, acceleration-aligned alarm drift, and source-augmented variants that underperformed target-only counterparts. This audit-first protocol demonstrates why same-dataset scores and record-any alarms can overstate deployability under compound shift.</w:t>
       </w:r>
     </w:p>
     <w:p>
@@ -199,7 +199,7 @@
           <w:rFonts w:ascii="Times New Roman" w:hAnsi="Times New Roman" w:eastAsia="Times New Roman"/>
           <w:sz w:val="20"/>
         </w:rPr>
-        <w:t>Cross-domain machinery diagnosis commonly aligns source and target representations or learns domain-invariant features. Benchmark surveys include source aggregation, DANN, MMD, CORAL, mixup, meta-learning, and ensemble approaches [6]. Collaborative multimachine and multi-dataset benchmarks establish that neither cross-machine diagnosis nor domain generalization is itself novel [7, 8]. Recent machinery methods also attempt to mitigate negative transfer [10, 20].</w:t>
+        <w:t>Cross-domain machinery diagnosis commonly aligns source and target representations or learns domain-invariant features. Benchmark surveys include source aggregation, domain-adversarial neural networks (DANN), maximum mean discrepancy (MMD), correlation alignment (CORAL), mixup, meta-learning, and ensemble approaches [6]. Collaborative multimachine and multi-dataset benchmarks establish that neither cross-machine diagnosis nor domain generalization is itself novel [7, 8]. Recent machinery methods also attempt to mitigate negative transfer [10, 20].</w:t>
       </w:r>
     </w:p>
     <w:p>
@@ -208,7 +208,7 @@
           <w:rFonts w:ascii="Times New Roman" w:hAnsi="Times New Roman" w:eastAsia="Times New Roman"/>
           <w:sz w:val="20"/>
         </w:rPr>
-        <w:t>The evaluation unit remains a separate problem. Signal-window holdout can share a physical part, acquisition day, or continuous trajectory between train and test and thereby measure interpolation rather than deployment [15]. This study instead treats the physical motor as the outer KAIST holdout, keeps external health roles in separate files/loads where possible, and reports paired fault effects at the record level. A source-supervised classifier is retained as a domain-shift diagnostic, while the principal task is a healthy-only target alarm.</w:t>
+        <w:t>The evaluation unit remains a separate problem. Signal-window holdout can share a physical part, acquisition day, or continuous trajectory between train and test and thereby measure interpolation rather than deployment [15]. This study instead treats each physical motor from the Korea Advanced Institute of Science and Technology (KAIST) dataset as the outer holdout, keeps external health roles in separate files/loads where possible, and reports paired fault effects at the record level. A source-supervised classifier is retained as a domain-shift diagnostic, while the principal task is a healthy-only target alarm.</w:t>
       </w:r>
     </w:p>
     <w:p>
@@ -220,7 +220,7 @@
           <w:rFonts w:ascii="Times New Roman" w:hAnsi="Times New Roman" w:eastAsia="Times New Roman"/>
           <w:sz w:val="20"/>
         </w:rPr>
-        <w:t>2.3 Healthy-only detectors, SPD transfer, and calibrated alarms</w:t>
+        <w:t>2.3 Healthy-only detectors, covariance geometry, and calibrated alarms</w:t>
       </w:r>
     </w:p>
     <w:p>
@@ -229,7 +229,7 @@
           <w:rFonts w:ascii="Times New Roman" w:hAnsi="Times New Roman" w:eastAsia="Times New Roman"/>
           <w:sz w:val="20"/>
         </w:rPr>
-        <w:t>One-class SVM, Isolation Forest, support-vector data description, and Minimum Covariance Determinant are established one-class or robust-description methods [21, 22, 23, 24]. Machinery studies have also fitted deep and classical one-class detectors from normal signals, although random normal-sample splits and fault-outcome-based hyperparameter selection can weaken a deployment interpretation [25]. These methods are consequently comparators here, not claimed innovations.</w:t>
+        <w:t>A one-class support vector machine (SVM), Isolation Forest, support-vector data description, and Minimum Covariance Determinant are established one-class or robust-description methods [21, 22, 23, 24]. Machinery studies have also fitted deep and classical one-class detectors from normal signals, although random normal-sample splits and fault-outcome-based hyperparameter selection can weaken a deployment interpretation [25]. These methods are consequently comparators here, not claimed innovations.</w:t>
       </w:r>
     </w:p>
     <w:p>
@@ -238,7 +238,7 @@
           <w:rFonts w:ascii="Times New Roman" w:hAnsi="Times New Roman" w:eastAsia="Times New Roman"/>
           <w:sz w:val="20"/>
         </w:rPr>
-        <w:t>A covariance matrix captures interactions among current-shape, imbalance, harmonic, and spectral features. Direct Euclidean averaging preserves symmetry and positive definiteness but does not respect the intrinsic geometry of SPD matrices. The Log-Euclidean construction maps matrices through the matrix logarithm, averages them in a vector space, and maps the result back by the matrix exponential [26]. Here each motor contributes one covariance and therefore one equal vote, irrespective of window count.</w:t>
+        <w:t>A covariance matrix captures interactions among current-shape, imbalance, harmonic, and spectral features. Direct Euclidean averaging preserves symmetry and positive definiteness but does not respect the intrinsic geometry of symmetric positive-definite (SPD) matrices. The Log-Euclidean construction maps matrices through the matrix logarithm, averages them in a vector space, and maps the result back by the matrix exponential [26]. Here each motor contributes one covariance and therefore one equal vote, irrespective of window count.</w:t>
       </w:r>
     </w:p>
     <w:p>
@@ -298,7 +298,7 @@
           <w:rFonts w:ascii="Times New Roman" w:hAnsi="Times New Roman" w:eastAsia="Times New Roman"/>
           <w:sz w:val="20"/>
         </w:rPr>
-        <w:t>The archive structure nominally contains one healthy record under each fault family. For every motor, those two healthy members have identical uncompressed size and CRC; an extracted pair was additionally identical by SHA-256. They are aliases rather than independent repeats. After deduplication, the current study contains three healthy and 42 fault records. Several fault TDMS files contain 121-149 s although the dataset description specifies 120 s. Every record is restricted to its first 120 s, producing equal record weight.</w:t>
+        <w:t>The archive structure nominally contains one healthy record under each fault family. For every motor, those two healthy members have identical uncompressed size and cyclic redundancy check (CRC); an extracted pair was additionally identical by a 256-bit Secure Hash Algorithm (SHA-256) digest. They are aliases rather than independent repeats. After deduplication, the current study contains three healthy and 42 fault records. Several Technical Data Management Streaming (TDMS) fault files contain 121-149 s although the dataset description specifies 120 s. Every record is restricted to its first 120 s, producing equal record weight.</w:t>
       </w:r>
     </w:p>
     <w:p>
@@ -307,7 +307,7 @@
           <w:rFonts w:ascii="Times New Roman" w:hAnsi="Times New Roman" w:eastAsia="Times New Roman"/>
           <w:sz w:val="20"/>
         </w:rPr>
-        <w:t>Each record is divided into 600 non-overlapping 0.2 s windows. Window features include phase RMS ratios, crest factor, kurtosis, Clarke-vector dispersion, sequence-current ratios, normalized harmonics, total harmonic distortion, sideband ratios, and spectral entropy. Absolute RMS, zero-sequence RMS, fundamental amplitude, and mean Clarke radius are excluded from the primary scale-free representation. The complete table contains 27,000 windows and no missing values.</w:t>
+        <w:t>Each record is divided into 600 non-overlapping 0.2 s windows. Window features include phase root-mean-square (RMS) ratios, crest factor, kurtosis, Clarke-vector dispersion, sequence-current ratios, normalized harmonics, total harmonic distortion, sideband ratios, and spectral entropy. Absolute RMS, zero-sequence RMS, fundamental amplitude, and mean Clarke radius are excluded from the primary scale-free representation. The complete table contains 27,000 windows and no missing values.</w:t>
       </w:r>
     </w:p>
     <w:p>
@@ -842,7 +842,7 @@
           <w:rFonts w:ascii="Times New Roman" w:hAnsi="Times New Roman" w:eastAsia="Times New Roman"/>
           <w:sz w:val="20"/>
         </w:rPr>
-        <w:t>Primary outcomes are the raw healthy false-alarm count, pooled Wilson interval, maximum per-motor empirical false-alarm rate, mean and worst-motor fault-block detection, and block AUROC. Paired method differences are computed for each of the 42 target fault records. A 10,000-replicate bootstrap resamples records within target motor and then averages the three motor means. Macroblocks and windows are not treated as independent experimental repetitions.</w:t>
+        <w:t>Primary outcomes are the raw healthy false-alarm count, pooled Wilson confidence interval (CI), maximum per-motor empirical false-alarm rate (FAR), mean and worst-motor fault-block detection, and block AUROC. Paired method differences are computed for each of the 42 target fault records. A 10,000-replicate bootstrap resamples records within target motor and then averages the three motor means. Macroblocks and windows are not treated as independent experimental repetitions.</w:t>
       </w:r>
     </w:p>
     <w:p>
@@ -881,7 +881,16 @@
           <w:rFonts w:ascii="Times New Roman" w:hAnsi="Times New Roman" w:eastAsia="Times New Roman"/>
           <w:sz w:val="20"/>
         </w:rPr>
-        <w:t>Each three-phase subsystem receives its own target robust alignment and target covariance. The three KAIST source motors and that target subsystem contribute one covariance each to a four-entity Log-Euclidean mean. Window maxima are first formed within each subsystem and then combined by a system maximum; the same system score is used for calibration. The 48 public fault records remained sealed until the protocol, feature parser, all comparator implementations, environment, healthy calibration scores, and thresholds were captured in hash-addressed commits. All 48 files were then downloaded from the official record, verified against a frozen filename/byte-count/MD5 manifest, and processed once over the unchanged [12, 36) s interval. The run yielded a complete 6 fault-turn counts by 8 loads grid (384 system blocks). The chronological reveal log and hash-addressed commits are retained as audit evidence.</w:t>
+        <w:t>Each three-phase subsystem receives its own target robust alignment and target covariance. The three KAIST source motors and that target subsystem contribute one covariance each to a four-entity Log-Euclidean mean. Window maxima are first formed within each subsystem and then combined by a system maximum; the same system score is used for calibration. The 48 public fault records remained sealed until the protocol, feature parser, all comparator implementations, environment, healthy calibration scores, and thresholds were captured in hash-addressed commits. All 48 files were then downloaded from the official record, verified against a frozen filename, byte-count, and Message-Digest Algorithm 5 (MD5) manifest, and processed once over the unchanged [12, 36) s interval. The run yielded a complete 6 fault-turn counts by 8 loads grid (384 system blocks). The chronological reveal log and hash-addressed commits are retained as audit evidence.</w:t>
+      </w:r>
+    </w:p>
+    <w:p>
+      <w:r>
+        <w:rPr>
+          <w:rFonts w:ascii="Times New Roman" w:hAnsi="Times New Roman" w:eastAsia="Times New Roman"/>
+          <w:sz w:val="20"/>
+        </w:rPr>
+        <w:t>The predeclared empirical health gate (H1) required both a descriptive pooled 95% Wilson upper confidence bound no greater than 12% and a maximum load-specific empirical FAR no greater than 15%. Because its 32 blocks came from four records of one motor, H1 was an engineering decision rule rather than a population-level probability guarantee.</w:t>
       </w:r>
     </w:p>
     <w:p>
@@ -969,12 +978,12 @@
         <w:tblInd w:w="120" w:type="dxa"/>
       </w:tblPr>
       <w:tblGrid>
-        <w:gridCol w:w="1816"/>
-        <w:gridCol w:w="1437"/>
-        <w:gridCol w:w="1741"/>
-        <w:gridCol w:w="1519"/>
-        <w:gridCol w:w="1437"/>
-        <w:gridCol w:w="1410"/>
+        <w:gridCol w:w="1753"/>
+        <w:gridCol w:w="1682"/>
+        <w:gridCol w:w="1682"/>
+        <w:gridCol w:w="1474"/>
+        <w:gridCol w:w="1397"/>
+        <w:gridCol w:w="1372"/>
       </w:tblGrid>
       <w:tr>
         <w:trPr>
@@ -982,7 +991,7 @@
         </w:trPr>
         <w:tc>
           <w:tcPr>
-            <w:tcW w:type="dxa" w:w="1816"/>
+            <w:tcW w:type="dxa" w:w="1753"/>
             <w:tcMar>
               <w:top w:w="80" w:type="dxa"/>
               <w:start w:w="120" w:type="dxa"/>
@@ -1009,7 +1018,7 @@
         </w:tc>
         <w:tc>
           <w:tcPr>
-            <w:tcW w:type="dxa" w:w="1437"/>
+            <w:tcW w:type="dxa" w:w="1682"/>
             <w:tcMar>
               <w:top w:w="80" w:type="dxa"/>
               <w:start w:w="120" w:type="dxa"/>
@@ -1030,13 +1039,13 @@
                 <w:b/>
                 <w:sz w:val="16"/>
               </w:rPr>
-              <w:t>Healthy FAR</w:t>
+              <w:t>Healthy false-alarm rate</w:t>
             </w:r>
           </w:p>
         </w:tc>
         <w:tc>
           <w:tcPr>
-            <w:tcW w:type="dxa" w:w="1741"/>
+            <w:tcW w:type="dxa" w:w="1682"/>
             <w:tcMar>
               <w:top w:w="80" w:type="dxa"/>
               <w:start w:w="120" w:type="dxa"/>
@@ -1063,7 +1072,7 @@
         </w:tc>
         <w:tc>
           <w:tcPr>
-            <w:tcW w:type="dxa" w:w="1519"/>
+            <w:tcW w:type="dxa" w:w="1474"/>
             <w:tcMar>
               <w:top w:w="80" w:type="dxa"/>
               <w:start w:w="120" w:type="dxa"/>
@@ -1090,7 +1099,7 @@
         </w:tc>
         <w:tc>
           <w:tcPr>
-            <w:tcW w:type="dxa" w:w="1437"/>
+            <w:tcW w:type="dxa" w:w="1397"/>
             <w:tcMar>
               <w:top w:w="80" w:type="dxa"/>
               <w:start w:w="120" w:type="dxa"/>
@@ -1117,7 +1126,7 @@
         </w:tc>
         <w:tc>
           <w:tcPr>
-            <w:tcW w:type="dxa" w:w="1410"/>
+            <w:tcW w:type="dxa" w:w="1372"/>
             <w:tcMar>
               <w:top w:w="80" w:type="dxa"/>
               <w:start w:w="120" w:type="dxa"/>
@@ -1146,7 +1155,7 @@
       <w:tr>
         <w:tc>
           <w:tcPr>
-            <w:tcW w:type="dxa" w:w="1816"/>
+            <w:tcW w:type="dxa" w:w="1753"/>
             <w:tcMar>
               <w:top w:w="80" w:type="dxa"/>
               <w:start w:w="120" w:type="dxa"/>
@@ -1172,7 +1181,7 @@
         </w:tc>
         <w:tc>
           <w:tcPr>
-            <w:tcW w:type="dxa" w:w="1437"/>
+            <w:tcW w:type="dxa" w:w="1682"/>
             <w:tcMar>
               <w:top w:w="80" w:type="dxa"/>
               <w:start w:w="120" w:type="dxa"/>
@@ -1198,7 +1207,7 @@
         </w:tc>
         <w:tc>
           <w:tcPr>
-            <w:tcW w:type="dxa" w:w="1741"/>
+            <w:tcW w:type="dxa" w:w="1682"/>
             <w:tcMar>
               <w:top w:w="80" w:type="dxa"/>
               <w:start w:w="120" w:type="dxa"/>
@@ -1224,7 +1233,7 @@
         </w:tc>
         <w:tc>
           <w:tcPr>
-            <w:tcW w:type="dxa" w:w="1519"/>
+            <w:tcW w:type="dxa" w:w="1474"/>
             <w:tcMar>
               <w:top w:w="80" w:type="dxa"/>
               <w:start w:w="120" w:type="dxa"/>
@@ -1250,7 +1259,7 @@
         </w:tc>
         <w:tc>
           <w:tcPr>
-            <w:tcW w:type="dxa" w:w="1437"/>
+            <w:tcW w:type="dxa" w:w="1397"/>
             <w:tcMar>
               <w:top w:w="80" w:type="dxa"/>
               <w:start w:w="120" w:type="dxa"/>
@@ -1276,7 +1285,7 @@
         </w:tc>
         <w:tc>
           <w:tcPr>
-            <w:tcW w:type="dxa" w:w="1410"/>
+            <w:tcW w:type="dxa" w:w="1372"/>
             <w:tcMar>
               <w:top w:w="80" w:type="dxa"/>
               <w:start w:w="120" w:type="dxa"/>
@@ -1304,7 +1313,7 @@
       <w:tr>
         <w:tc>
           <w:tcPr>
-            <w:tcW w:type="dxa" w:w="1816"/>
+            <w:tcW w:type="dxa" w:w="1753"/>
             <w:tcMar>
               <w:top w:w="80" w:type="dxa"/>
               <w:start w:w="120" w:type="dxa"/>
@@ -1330,7 +1339,7 @@
         </w:tc>
         <w:tc>
           <w:tcPr>
-            <w:tcW w:type="dxa" w:w="1437"/>
+            <w:tcW w:type="dxa" w:w="1682"/>
             <w:tcMar>
               <w:top w:w="80" w:type="dxa"/>
               <w:start w:w="120" w:type="dxa"/>
@@ -1356,7 +1365,7 @@
         </w:tc>
         <w:tc>
           <w:tcPr>
-            <w:tcW w:type="dxa" w:w="1741"/>
+            <w:tcW w:type="dxa" w:w="1682"/>
             <w:tcMar>
               <w:top w:w="80" w:type="dxa"/>
               <w:start w:w="120" w:type="dxa"/>
@@ -1382,7 +1391,7 @@
         </w:tc>
         <w:tc>
           <w:tcPr>
-            <w:tcW w:type="dxa" w:w="1519"/>
+            <w:tcW w:type="dxa" w:w="1474"/>
             <w:tcMar>
               <w:top w:w="80" w:type="dxa"/>
               <w:start w:w="120" w:type="dxa"/>
@@ -1408,7 +1417,7 @@
         </w:tc>
         <w:tc>
           <w:tcPr>
-            <w:tcW w:type="dxa" w:w="1437"/>
+            <w:tcW w:type="dxa" w:w="1397"/>
             <w:tcMar>
               <w:top w:w="80" w:type="dxa"/>
               <w:start w:w="120" w:type="dxa"/>
@@ -1434,7 +1443,7 @@
         </w:tc>
         <w:tc>
           <w:tcPr>
-            <w:tcW w:type="dxa" w:w="1410"/>
+            <w:tcW w:type="dxa" w:w="1372"/>
             <w:tcMar>
               <w:top w:w="80" w:type="dxa"/>
               <w:start w:w="120" w:type="dxa"/>
@@ -1462,7 +1471,7 @@
       <w:tr>
         <w:tc>
           <w:tcPr>
-            <w:tcW w:type="dxa" w:w="1816"/>
+            <w:tcW w:type="dxa" w:w="1753"/>
             <w:tcMar>
               <w:top w:w="80" w:type="dxa"/>
               <w:start w:w="120" w:type="dxa"/>
@@ -1488,7 +1497,7 @@
         </w:tc>
         <w:tc>
           <w:tcPr>
-            <w:tcW w:type="dxa" w:w="1437"/>
+            <w:tcW w:type="dxa" w:w="1682"/>
             <w:tcMar>
               <w:top w:w="80" w:type="dxa"/>
               <w:start w:w="120" w:type="dxa"/>
@@ -1514,7 +1523,7 @@
         </w:tc>
         <w:tc>
           <w:tcPr>
-            <w:tcW w:type="dxa" w:w="1741"/>
+            <w:tcW w:type="dxa" w:w="1682"/>
             <w:tcMar>
               <w:top w:w="80" w:type="dxa"/>
               <w:start w:w="120" w:type="dxa"/>
@@ -1540,7 +1549,7 @@
         </w:tc>
         <w:tc>
           <w:tcPr>
-            <w:tcW w:type="dxa" w:w="1519"/>
+            <w:tcW w:type="dxa" w:w="1474"/>
             <w:tcMar>
               <w:top w:w="80" w:type="dxa"/>
               <w:start w:w="120" w:type="dxa"/>
@@ -1566,7 +1575,7 @@
         </w:tc>
         <w:tc>
           <w:tcPr>
-            <w:tcW w:type="dxa" w:w="1437"/>
+            <w:tcW w:type="dxa" w:w="1397"/>
             <w:tcMar>
               <w:top w:w="80" w:type="dxa"/>
               <w:start w:w="120" w:type="dxa"/>
@@ -1592,7 +1601,7 @@
         </w:tc>
         <w:tc>
           <w:tcPr>
-            <w:tcW w:type="dxa" w:w="1410"/>
+            <w:tcW w:type="dxa" w:w="1372"/>
             <w:tcMar>
               <w:top w:w="80" w:type="dxa"/>
               <w:start w:w="120" w:type="dxa"/>
@@ -1620,7 +1629,7 @@
       <w:tr>
         <w:tc>
           <w:tcPr>
-            <w:tcW w:type="dxa" w:w="1816"/>
+            <w:tcW w:type="dxa" w:w="1753"/>
             <w:tcMar>
               <w:top w:w="80" w:type="dxa"/>
               <w:start w:w="120" w:type="dxa"/>
@@ -1646,7 +1655,7 @@
         </w:tc>
         <w:tc>
           <w:tcPr>
-            <w:tcW w:type="dxa" w:w="1437"/>
+            <w:tcW w:type="dxa" w:w="1682"/>
             <w:tcMar>
               <w:top w:w="80" w:type="dxa"/>
               <w:start w:w="120" w:type="dxa"/>
@@ -1672,7 +1681,7 @@
         </w:tc>
         <w:tc>
           <w:tcPr>
-            <w:tcW w:type="dxa" w:w="1741"/>
+            <w:tcW w:type="dxa" w:w="1682"/>
             <w:tcMar>
               <w:top w:w="80" w:type="dxa"/>
               <w:start w:w="120" w:type="dxa"/>
@@ -1698,7 +1707,7 @@
         </w:tc>
         <w:tc>
           <w:tcPr>
-            <w:tcW w:type="dxa" w:w="1519"/>
+            <w:tcW w:type="dxa" w:w="1474"/>
             <w:tcMar>
               <w:top w:w="80" w:type="dxa"/>
               <w:start w:w="120" w:type="dxa"/>
@@ -1724,7 +1733,7 @@
         </w:tc>
         <w:tc>
           <w:tcPr>
-            <w:tcW w:type="dxa" w:w="1437"/>
+            <w:tcW w:type="dxa" w:w="1397"/>
             <w:tcMar>
               <w:top w:w="80" w:type="dxa"/>
               <w:start w:w="120" w:type="dxa"/>
@@ -1750,7 +1759,7 @@
         </w:tc>
         <w:tc>
           <w:tcPr>
-            <w:tcW w:type="dxa" w:w="1410"/>
+            <w:tcW w:type="dxa" w:w="1372"/>
             <w:tcMar>
               <w:top w:w="80" w:type="dxa"/>
               <w:start w:w="120" w:type="dxa"/>
@@ -1778,7 +1787,7 @@
       <w:tr>
         <w:tc>
           <w:tcPr>
-            <w:tcW w:type="dxa" w:w="1816"/>
+            <w:tcW w:type="dxa" w:w="1753"/>
             <w:tcMar>
               <w:top w:w="80" w:type="dxa"/>
               <w:start w:w="120" w:type="dxa"/>
@@ -1804,7 +1813,7 @@
         </w:tc>
         <w:tc>
           <w:tcPr>
-            <w:tcW w:type="dxa" w:w="1437"/>
+            <w:tcW w:type="dxa" w:w="1682"/>
             <w:tcMar>
               <w:top w:w="80" w:type="dxa"/>
               <w:start w:w="120" w:type="dxa"/>
@@ -1830,7 +1839,7 @@
         </w:tc>
         <w:tc>
           <w:tcPr>
-            <w:tcW w:type="dxa" w:w="1741"/>
+            <w:tcW w:type="dxa" w:w="1682"/>
             <w:tcMar>
               <w:top w:w="80" w:type="dxa"/>
               <w:start w:w="120" w:type="dxa"/>
@@ -1856,7 +1865,7 @@
         </w:tc>
         <w:tc>
           <w:tcPr>
-            <w:tcW w:type="dxa" w:w="1519"/>
+            <w:tcW w:type="dxa" w:w="1474"/>
             <w:tcMar>
               <w:top w:w="80" w:type="dxa"/>
               <w:start w:w="120" w:type="dxa"/>
@@ -1882,7 +1891,7 @@
         </w:tc>
         <w:tc>
           <w:tcPr>
-            <w:tcW w:type="dxa" w:w="1437"/>
+            <w:tcW w:type="dxa" w:w="1397"/>
             <w:tcMar>
               <w:top w:w="80" w:type="dxa"/>
               <w:start w:w="120" w:type="dxa"/>
@@ -1908,7 +1917,7 @@
         </w:tc>
         <w:tc>
           <w:tcPr>
-            <w:tcW w:type="dxa" w:w="1410"/>
+            <w:tcW w:type="dxa" w:w="1372"/>
             <w:tcMar>
               <w:top w:w="80" w:type="dxa"/>
               <w:start w:w="120" w:type="dxa"/>
@@ -2134,10 +2143,10 @@
         <w:tblInd w:w="120" w:type="dxa"/>
       </w:tblPr>
       <w:tblGrid>
-        <w:gridCol w:w="3218"/>
-        <w:gridCol w:w="1995"/>
-        <w:gridCol w:w="2149"/>
-        <w:gridCol w:w="1998"/>
+        <w:gridCol w:w="3013"/>
+        <w:gridCol w:w="2416"/>
+        <w:gridCol w:w="2034"/>
+        <w:gridCol w:w="1897"/>
       </w:tblGrid>
       <w:tr>
         <w:trPr>
@@ -2145,7 +2154,7 @@
         </w:trPr>
         <w:tc>
           <w:tcPr>
-            <w:tcW w:type="dxa" w:w="3218"/>
+            <w:tcW w:type="dxa" w:w="3013"/>
             <w:tcMar>
               <w:top w:w="80" w:type="dxa"/>
               <w:start w:w="120" w:type="dxa"/>
@@ -2172,7 +2181,7 @@
         </w:tc>
         <w:tc>
           <w:tcPr>
-            <w:tcW w:type="dxa" w:w="1995"/>
+            <w:tcW w:type="dxa" w:w="2416"/>
             <w:tcMar>
               <w:top w:w="80" w:type="dxa"/>
               <w:start w:w="120" w:type="dxa"/>
@@ -2193,13 +2202,13 @@
                 <w:b/>
                 <w:sz w:val="16"/>
               </w:rPr>
-              <w:t>Healthy FAR</w:t>
+              <w:t>Healthy false-alarm rate</w:t>
             </w:r>
           </w:p>
         </w:tc>
         <w:tc>
           <w:tcPr>
-            <w:tcW w:type="dxa" w:w="2149"/>
+            <w:tcW w:type="dxa" w:w="2034"/>
             <w:tcMar>
               <w:top w:w="80" w:type="dxa"/>
               <w:start w:w="120" w:type="dxa"/>
@@ -2226,7 +2235,7 @@
         </w:tc>
         <w:tc>
           <w:tcPr>
-            <w:tcW w:type="dxa" w:w="1998"/>
+            <w:tcW w:type="dxa" w:w="1897"/>
             <w:tcMar>
               <w:top w:w="80" w:type="dxa"/>
               <w:start w:w="120" w:type="dxa"/>
@@ -2255,7 +2264,7 @@
       <w:tr>
         <w:tc>
           <w:tcPr>
-            <w:tcW w:type="dxa" w:w="3218"/>
+            <w:tcW w:type="dxa" w:w="3013"/>
             <w:tcMar>
               <w:top w:w="80" w:type="dxa"/>
               <w:start w:w="120" w:type="dxa"/>
@@ -2281,7 +2290,7 @@
         </w:tc>
         <w:tc>
           <w:tcPr>
-            <w:tcW w:type="dxa" w:w="1995"/>
+            <w:tcW w:type="dxa" w:w="2416"/>
             <w:tcMar>
               <w:top w:w="80" w:type="dxa"/>
               <w:start w:w="120" w:type="dxa"/>
@@ -2307,7 +2316,7 @@
         </w:tc>
         <w:tc>
           <w:tcPr>
-            <w:tcW w:type="dxa" w:w="2149"/>
+            <w:tcW w:type="dxa" w:w="2034"/>
             <w:tcMar>
               <w:top w:w="80" w:type="dxa"/>
               <w:start w:w="120" w:type="dxa"/>
@@ -2333,7 +2342,7 @@
         </w:tc>
         <w:tc>
           <w:tcPr>
-            <w:tcW w:type="dxa" w:w="1998"/>
+            <w:tcW w:type="dxa" w:w="1897"/>
             <w:tcMar>
               <w:top w:w="80" w:type="dxa"/>
               <w:start w:w="120" w:type="dxa"/>
@@ -2361,7 +2370,7 @@
       <w:tr>
         <w:tc>
           <w:tcPr>
-            <w:tcW w:type="dxa" w:w="3218"/>
+            <w:tcW w:type="dxa" w:w="3013"/>
             <w:tcMar>
               <w:top w:w="80" w:type="dxa"/>
               <w:start w:w="120" w:type="dxa"/>
@@ -2387,7 +2396,7 @@
         </w:tc>
         <w:tc>
           <w:tcPr>
-            <w:tcW w:type="dxa" w:w="1995"/>
+            <w:tcW w:type="dxa" w:w="2416"/>
             <w:tcMar>
               <w:top w:w="80" w:type="dxa"/>
               <w:start w:w="120" w:type="dxa"/>
@@ -2413,7 +2422,7 @@
         </w:tc>
         <w:tc>
           <w:tcPr>
-            <w:tcW w:type="dxa" w:w="2149"/>
+            <w:tcW w:type="dxa" w:w="2034"/>
             <w:tcMar>
               <w:top w:w="80" w:type="dxa"/>
               <w:start w:w="120" w:type="dxa"/>
@@ -2439,7 +2448,7 @@
         </w:tc>
         <w:tc>
           <w:tcPr>
-            <w:tcW w:type="dxa" w:w="1998"/>
+            <w:tcW w:type="dxa" w:w="1897"/>
             <w:tcMar>
               <w:top w:w="80" w:type="dxa"/>
               <w:start w:w="120" w:type="dxa"/>
@@ -2467,7 +2476,7 @@
       <w:tr>
         <w:tc>
           <w:tcPr>
-            <w:tcW w:type="dxa" w:w="3218"/>
+            <w:tcW w:type="dxa" w:w="3013"/>
             <w:tcMar>
               <w:top w:w="80" w:type="dxa"/>
               <w:start w:w="120" w:type="dxa"/>
@@ -2493,7 +2502,7 @@
         </w:tc>
         <w:tc>
           <w:tcPr>
-            <w:tcW w:type="dxa" w:w="1995"/>
+            <w:tcW w:type="dxa" w:w="2416"/>
             <w:tcMar>
               <w:top w:w="80" w:type="dxa"/>
               <w:start w:w="120" w:type="dxa"/>
@@ -2519,7 +2528,7 @@
         </w:tc>
         <w:tc>
           <w:tcPr>
-            <w:tcW w:type="dxa" w:w="2149"/>
+            <w:tcW w:type="dxa" w:w="2034"/>
             <w:tcMar>
               <w:top w:w="80" w:type="dxa"/>
               <w:start w:w="120" w:type="dxa"/>
@@ -2545,7 +2554,7 @@
         </w:tc>
         <w:tc>
           <w:tcPr>
-            <w:tcW w:type="dxa" w:w="1998"/>
+            <w:tcW w:type="dxa" w:w="1897"/>
             <w:tcMar>
               <w:top w:w="80" w:type="dxa"/>
               <w:start w:w="120" w:type="dxa"/>
@@ -2573,7 +2582,7 @@
       <w:tr>
         <w:tc>
           <w:tcPr>
-            <w:tcW w:type="dxa" w:w="3218"/>
+            <w:tcW w:type="dxa" w:w="3013"/>
             <w:tcMar>
               <w:top w:w="80" w:type="dxa"/>
               <w:start w:w="120" w:type="dxa"/>
@@ -2599,7 +2608,7 @@
         </w:tc>
         <w:tc>
           <w:tcPr>
-            <w:tcW w:type="dxa" w:w="1995"/>
+            <w:tcW w:type="dxa" w:w="2416"/>
             <w:tcMar>
               <w:top w:w="80" w:type="dxa"/>
               <w:start w:w="120" w:type="dxa"/>
@@ -2625,7 +2634,7 @@
         </w:tc>
         <w:tc>
           <w:tcPr>
-            <w:tcW w:type="dxa" w:w="2149"/>
+            <w:tcW w:type="dxa" w:w="2034"/>
             <w:tcMar>
               <w:top w:w="80" w:type="dxa"/>
               <w:start w:w="120" w:type="dxa"/>
@@ -2651,7 +2660,7 @@
         </w:tc>
         <w:tc>
           <w:tcPr>
-            <w:tcW w:type="dxa" w:w="1998"/>
+            <w:tcW w:type="dxa" w:w="1897"/>
             <w:tcMar>
               <w:top w:w="80" w:type="dxa"/>
               <w:start w:w="120" w:type="dxa"/>
@@ -2679,7 +2688,7 @@
       <w:tr>
         <w:tc>
           <w:tcPr>
-            <w:tcW w:type="dxa" w:w="3218"/>
+            <w:tcW w:type="dxa" w:w="3013"/>
             <w:tcMar>
               <w:top w:w="80" w:type="dxa"/>
               <w:start w:w="120" w:type="dxa"/>
@@ -2705,7 +2714,7 @@
         </w:tc>
         <w:tc>
           <w:tcPr>
-            <w:tcW w:type="dxa" w:w="1995"/>
+            <w:tcW w:type="dxa" w:w="2416"/>
             <w:tcMar>
               <w:top w:w="80" w:type="dxa"/>
               <w:start w:w="120" w:type="dxa"/>
@@ -2731,7 +2740,7 @@
         </w:tc>
         <w:tc>
           <w:tcPr>
-            <w:tcW w:type="dxa" w:w="2149"/>
+            <w:tcW w:type="dxa" w:w="2034"/>
             <w:tcMar>
               <w:top w:w="80" w:type="dxa"/>
               <w:start w:w="120" w:type="dxa"/>
@@ -2757,7 +2766,7 @@
         </w:tc>
         <w:tc>
           <w:tcPr>
-            <w:tcW w:type="dxa" w:w="1998"/>
+            <w:tcW w:type="dxa" w:w="1897"/>
             <w:tcMar>
               <w:top w:w="80" w:type="dxa"/>
               <w:start w:w="120" w:type="dxa"/>
@@ -2785,7 +2794,7 @@
       <w:tr>
         <w:tc>
           <w:tcPr>
-            <w:tcW w:type="dxa" w:w="3218"/>
+            <w:tcW w:type="dxa" w:w="3013"/>
             <w:tcMar>
               <w:top w:w="80" w:type="dxa"/>
               <w:start w:w="120" w:type="dxa"/>
@@ -2811,7 +2820,7 @@
         </w:tc>
         <w:tc>
           <w:tcPr>
-            <w:tcW w:type="dxa" w:w="1995"/>
+            <w:tcW w:type="dxa" w:w="2416"/>
             <w:tcMar>
               <w:top w:w="80" w:type="dxa"/>
               <w:start w:w="120" w:type="dxa"/>
@@ -2837,7 +2846,7 @@
         </w:tc>
         <w:tc>
           <w:tcPr>
-            <w:tcW w:type="dxa" w:w="2149"/>
+            <w:tcW w:type="dxa" w:w="2034"/>
             <w:tcMar>
               <w:top w:w="80" w:type="dxa"/>
               <w:start w:w="120" w:type="dxa"/>
@@ -2863,7 +2872,7 @@
         </w:tc>
         <w:tc>
           <w:tcPr>
-            <w:tcW w:type="dxa" w:w="1998"/>
+            <w:tcW w:type="dxa" w:w="1897"/>
             <w:tcMar>
               <w:top w:w="80" w:type="dxa"/>
               <w:start w:w="120" w:type="dxa"/>
@@ -2891,7 +2900,7 @@
       <w:tr>
         <w:tc>
           <w:tcPr>
-            <w:tcW w:type="dxa" w:w="3218"/>
+            <w:tcW w:type="dxa" w:w="3013"/>
             <w:tcMar>
               <w:top w:w="80" w:type="dxa"/>
               <w:start w:w="120" w:type="dxa"/>
@@ -2917,7 +2926,7 @@
         </w:tc>
         <w:tc>
           <w:tcPr>
-            <w:tcW w:type="dxa" w:w="1995"/>
+            <w:tcW w:type="dxa" w:w="2416"/>
             <w:tcMar>
               <w:top w:w="80" w:type="dxa"/>
               <w:start w:w="120" w:type="dxa"/>
@@ -2943,7 +2952,7 @@
         </w:tc>
         <w:tc>
           <w:tcPr>
-            <w:tcW w:type="dxa" w:w="2149"/>
+            <w:tcW w:type="dxa" w:w="2034"/>
             <w:tcMar>
               <w:top w:w="80" w:type="dxa"/>
               <w:start w:w="120" w:type="dxa"/>
@@ -2969,7 +2978,7 @@
         </w:tc>
         <w:tc>
           <w:tcPr>
-            <w:tcW w:type="dxa" w:w="1998"/>
+            <w:tcW w:type="dxa" w:w="1897"/>
             <w:tcMar>
               <w:top w:w="80" w:type="dxa"/>
               <w:start w:w="120" w:type="dxa"/>
@@ -3170,7 +3179,7 @@
           <w:rFonts w:ascii="Times New Roman" w:hAnsi="Times New Roman" w:eastAsia="Times New Roman"/>
           <w:sz w:val="20"/>
         </w:rPr>
-        <w:t>The 3 s maximum exactly reproduced the primary outputs. With the same 60 s calibration horizon, 1 s and 2 s maxima reduced mean detection to 93.61% and 93.73%, respectively. A 3 s 90th-percentile aggregation increased mean detection to 97.32% but introduced 1/42 healthy false alarms; its descriptive Wilson upper bound was 12.32%, above the predeclared 12% gate. It therefore does not replace the health-ACF-selected primary setting. Five- and six-second blocks supply only 12 and 10 calibration units and were skipped because they cannot resolve an alarm level of 0.05. Block-length and aggregation sensitivity are summarized in Fig. 6.</w:t>
+        <w:t>The 3 s maximum exactly reproduced the primary outputs. With the same 60 s calibration horizon, 1 s and 2 s maxima reduced mean detection to 93.61% and 93.73%, respectively. A 3 s 90th-percentile aggregation increased mean detection to 97.32% but introduced 1/42 healthy false alarms; its descriptive Wilson upper bound was 12.32%, above the predeclared 12% gate. It therefore does not replace the primary setting selected from health autocorrelation. Five- and six-second blocks supply only 12 and 10 calibration units and were skipped because they cannot resolve an alarm level of 0.05. Block-length and aggregation sensitivity are summarized in Fig. 6.</w:t>
       </w:r>
     </w:p>
     <w:p>
@@ -5471,7 +5480,7 @@
           <w:rFonts w:ascii="Times New Roman" w:hAnsi="Times New Roman" w:eastAsia="Times New Roman"/>
           <w:sz w:val="20"/>
         </w:rPr>
-        <w:t>The 10 kHz KAIST arm remained usable internally: exploratory LOMO detection decreased from 95.71% to 91.96% and AUROC from 0.9993 to 0.9947. Replacing only the source arm in the frozen external run did not recover transfer. Log-Euclidean external detection changed from 25.00% to 24.74%, AUROC from 0.6354 to 0.6331, and healthy alarms remained 1/32. Forty-seven of 48 fault records were unchanged and one worsened; none improved. Target-only MinCovDet was, by construction, unchanged at 70.05%, so its lead over the transfer detector increased from 45.05 to 45.31 points. The sampling-rate mismatch may affect individual features, but this controlled sensitivity does not support it as the primary explanation for the observed negative transfer.</w:t>
+        <w:t>The 10 kHz KAIST arm remained usable internally: exploratory leave-one-motor-out detection decreased from 95.71% to 91.96% and AUROC from 0.9993 to 0.9947. Replacing only the source arm in the frozen external run did not recover transfer. Log-Euclidean external detection changed from 25.00% to 24.74%, AUROC from 0.6354 to 0.6331, and healthy alarms remained 1/32. Forty-seven of 48 fault records were unchanged and one worsened; none improved. Target-only MinCovDet was, by construction, unchanged at 70.05%, so its lead over the transfer detector increased from 45.05 to 45.31 points. The sampling-rate mismatch may affect individual features, but this controlled sensitivity does not support it as the primary explanation for the observed negative transfer.</w:t>
       </w:r>
     </w:p>
     <w:p>
@@ -5545,7 +5554,7 @@
           <w:rFonts w:ascii="Times New Roman" w:hAnsi="Times New Roman" w:eastAsia="Times New Roman"/>
           <w:sz w:val="20"/>
         </w:rPr>
-        <w:t>The ordered-block analysis changes the interpretation of the raw external outcomes. All 48 fault records alarmed in block 7, while some had already alarmed in earlier blocks; the final block's operating point also drove the healthy score upward. Record-any detection would therefore report 100% while hiding poor early-trajectory coverage and a late healthy false alarm. Pooled AUPRC similarly adds limited operational information unless interpreted against the 384/416 = 92.3% fault-block prevalence, which gives an all-positive ranking a baseline near 0.923. The appropriate evidence is the joint display of chronological block detection, held-out health alarms, per-condition coverage, and record-level paired differences.</w:t>
+        <w:t>The ordered-block analysis changes the interpretation of the raw external outcomes. All 48 fault records alarmed in block 7, while some had already alarmed in earlier blocks; the final block's operating point also drove the healthy score upward. Record-any detection would therefore report 100% while hiding poor early-trajectory coverage and a late healthy false alarm. Pooled area under the precision-recall curve (AUPRC) similarly adds limited operational information unless interpreted against the 384/416 = 92.3% fault-block prevalence, which gives an all-positive ranking a baseline near 0.923. The appropriate evidence is the joint display of chronological block detection, held-out health alarms, per-condition coverage, and record-level paired differences.</w:t>
       </w:r>
     </w:p>
     <w:p>
@@ -5632,7 +5641,7 @@
           <w:rFonts w:ascii="Times New Roman" w:hAnsi="Times New Roman" w:eastAsia="Times New Roman"/>
           <w:sz w:val="20"/>
         </w:rPr>
-        <w:t>The KAIST source dataset is available from Mendeley Data; the independent dual-three-phase PMSM dataset and the secondary 200 W/20 kW transient dataset are available from Zenodo. All three are under CC BY 4.0 [31, 32, 34]. The project contains resumable checksummed downloads, archive and MAT audits, duplicate removal, feature extraction, motor/file-level evaluation, paired bootstrap, sensitivity analyses, automated tests, and figure generation. Raw data remain excluded from version control; the reveal manifests, protocols, selected derived results, and audit metadata are retained for exact reconstruction. Detailed partitions, thresholds, comparator results, post-reveal diagnostics, sampling-rate controls, transient-set compatibility outcomes, and file hashes are provided in Online Resource 1. The anonymized code, automated tests, protocols, and selected derived outputs needed to rerun the reported analyses are provided in Online Resource 2.</w:t>
+        <w:t>The KAIST source dataset is available from Mendeley Data; the independent dual-three-phase PMSM dataset and the secondary 200 W/20 kW transient dataset are available from Zenodo. All three are under the Creative Commons Attribution (CC BY) 4.0 licence [31, 32, 34]. The project contains resumable checksummed downloads, archive and MATLAB-file audits, duplicate removal, feature extraction, motor/file-level evaluation, paired bootstrap, sensitivity analyses, automated tests, and figure generation. Raw data remain excluded from version control; the reveal manifests, protocols, selected derived results, and audit metadata are retained for exact reconstruction. Detailed partitions, thresholds, comparator results, post-reveal diagnostics, sampling-rate controls, transient-set compatibility outcomes, and file hashes are provided in Online Resource 1. The anonymized code, automated tests, protocols, and selected derived outputs needed to rerun the reported analyses are provided in Online Resource 2.</w:t>
       </w:r>
     </w:p>
     <w:p>
@@ -5749,7 +5758,7 @@
           <w:rFonts w:ascii="Times New Roman" w:hAnsi="Times New Roman" w:eastAsia="Times New Roman"/>
           <w:sz w:val="20"/>
         </w:rPr>
-        <w:t>An LLM-based coding assistant was used under human direction for implementation support, automated consistency checks, and manuscript drafting and editing. All reported computations were executed on the cited datasets and checked against frozen outputs and automated tests. The human authors remain responsible for reviewing and approving the submitted version.</w:t>
+        <w:t>A large language model (LLM)-based coding assistant was used under human direction for implementation support, automated consistency checks, and manuscript drafting and editing. All reported computations were executed on the cited datasets and checked against frozen outputs and automated tests. The human authors remain responsible for reviewing and approving the submitted version.</w:t>
       </w:r>
     </w:p>
     <w:p>

</xml_diff>

<commit_message>
Audit manuscript evidence and external confounding
</commit_message>
<xml_diff>
--- a/submission/jeet/Manuscript_Anonymous.docx
+++ b/submission/jeet/Manuscript_Anonymous.docx
@@ -32,7 +32,7 @@
           <w:rFonts w:ascii="Times New Roman" w:hAnsi="Times New Roman" w:eastAsia="Times New Roman"/>
           <w:sz w:val="20"/>
         </w:rPr>
-        <w:t>High within-dataset accuracy does not establish that a healthy-only stator-fault detector will transfer to a different permanent-magnet synchronous motor (PMSM). We evaluate eleven covariance and one-class detectors across two datasets with motor/file separation, chronological target-health splits, 3 s alarm blocks, and no target-fault labels for fitting or thresholding. An exploratory study used three same-manufacturer 1.0, 1.5, and 3.0 kW PMSMs at fixed speed and load. The motor-balanced Log-Euclidean detector produced 0/42 healthy alarms and 95.71% fault-block detection. A motor-balanced Isolation Forest produced 0/42 and 96.07%, without a resolved difference. We froze the pipeline and health threshold before revealing 48 fault records from an independent dual-three-phase PMSM accelerated at eight loads. The frozen detector failed its empirical health gate (1/32 alarms; descriptive 95% Wilson upper confidence bound 15.74% versus a 12% limit), detected 25.00% of fault blocks (95% turn-stratified record-bootstrap interval 21.09-29.43%), and attained an area under the receiver-operating-characteristic curve (AUROC) of 0.635. Target-only Minimum Covariance Determinant produced 0/32 healthy alarms, 70.05% detection (65.36-75.26%), and AUROC 0.927. The frozen detector alarmed on none of 48 records in the first three blocks but on all 48 in the final block; detection also fell from 56.25% at 0 N m to 12.50% at 35 N m. Conditional on this external motor, the results reveal a ranking reversal, acceleration-aligned alarm drift, and source-augmented variants that underperformed target-only counterparts. This audit-first protocol demonstrates why same-dataset scores and record-any alarms can overstate deployability under compound shift.</w:t>
+        <w:t>High within-dataset accuracy does not establish that a healthy-only stator-fault detector will transfer to a different permanent-magnet synchronous motor (PMSM). We evaluate eleven healthy-only detectors in a primary two-dataset analysis with motor/file separation, chronological target-health splits, 3 s alarm blocks, and no target-fault labels for fitting or thresholding. An exploratory study used three same-manufacturer 1.0, 1.5, and 3.0 kW PMSMs at fixed speed and load. The motor-balanced Log-Euclidean detector produced 0/42 healthy alarms and 95.71% fault-block detection. A motor-balanced Isolation Forest produced 0/42 and 96.07%, without a resolved difference. We froze the pipeline and health threshold before revealing 48 fault records from an independent dual-three-phase PMSM accelerated at eight loads. The frozen detector failed its empirical health gate (1/32 alarms; descriptive 95% Wilson upper confidence bound 15.74% versus a 12% limit), detected 25.00% of fault blocks (95% turn-stratified record-bootstrap interval 21.09-29.43%), and attained an area under the receiver-operating-characteristic curve (AUROC) of 0.635. Target-only Minimum Covariance Determinant produced 0/32 healthy alarms, 70.05% detection (65.36-75.26%), and AUROC 0.927. The frozen detector alarmed on none of 48 records in the first three blocks but on all 48 in the final block; detection also fell from 56.25% at 0 N m to 12.50% at 35 N m. Conditional on this external motor, the results reveal a ranking reversal, acceleration-aligned alarm drift, and source-augmented variants that underperformed target-only counterparts. This audit-first protocol demonstrates why same-dataset scores and record-any alarms can overstate deployability under compound shift.</w:t>
       </w:r>
     </w:p>
     <w:p>
@@ -890,7 +890,16 @@
           <w:rFonts w:ascii="Times New Roman" w:hAnsi="Times New Roman" w:eastAsia="Times New Roman"/>
           <w:sz w:val="20"/>
         </w:rPr>
-        <w:t>The predeclared empirical health gate (H1) required both a descriptive pooled 95% Wilson upper confidence bound no greater than 12% and a maximum load-specific empirical FAR no greater than 15%. Because its 32 blocks came from four records of one motor, H1 was an engineering decision rule rather than a population-level probability guarantee.</w:t>
+        <w:t>The six fault-turn levels were not crossed with fault phase: 1-, 3-, 5-, and 6-turn faults were assigned to phase U, whereas 2- and 4-turn faults were assigned to phase V. Thus fault-turn count and fault phase are not fully crossed, and their separate effects are not identifiable from this external dataset.</w:t>
+      </w:r>
+    </w:p>
+    <w:p>
+      <w:r>
+        <w:rPr>
+          <w:rFonts w:ascii="Times New Roman" w:hAnsi="Times New Roman" w:eastAsia="Times New Roman"/>
+          <w:sz w:val="20"/>
+        </w:rPr>
+        <w:t>The predeclared empirical health gate (H1) required both a descriptive pooled 95% Wilson upper confidence bound no greater than 12% and a maximum load-specific empirical FAR no greater than 15%. Because its 32 blocks came from four records of one motor, H1 was an engineering decision rule rather than a population-level probability guarantee. The fault endpoint covers all eight loads, whereas the held-out health endpoint covers 5, 15, 25, and 35 N m. Pooled external block AUROC therefore contrasts eight fault-load conditions with four health-load conditions and is descriptive rather than load matched.</w:t>
       </w:r>
     </w:p>
     <w:p>
@@ -3352,7 +3361,7 @@
           <w:rFonts w:ascii="Times New Roman" w:hAnsi="Times New Roman" w:eastAsia="Times New Roman"/>
           <w:sz w:val="20"/>
         </w:rPr>
-        <w:t>The fault result reversed the exploratory KAIST ranking. The frozen detector identified 25.00% of the 384 ordered fault blocks (turn-stratified record-bootstrap 95% interval, 21.09-29.43%) and attained pooled block AUROC 0.6354. Target-only MinCovDet, which had been implemented before reveal, produced 0/32 healthy alarms, 70.05% detection (65.36-75.26%), and AUROC 0.9268. The paired improvement of target MinCovDet over the frozen detector was 45.05 percentage points (40.63-49.48%). Target-only MinCovDet is reported as the observed comparator leader, not retroactively redesignated as the primary method.</w:t>
+        <w:t>The fault result reversed the exploratory KAIST ranking. The frozen detector identified 25.00% of the 384 ordered fault blocks (turn-stratified record-bootstrap 95% interval, 21.09-29.43%) and attained pooled block AUROC 0.6354. Target-only MinCovDet, which had been implemented before reveal, produced 0/32 healthy alarms, 70.05% detection (65.36-75.26%), and AUROC 0.9268. The paired improvement of target MinCovDet over the frozen detector was 45.05 percentage points (40.62-49.48%). Target-only MinCovDet is reported as the observed comparator leader, not retroactively redesignated as the primary method.</w:t>
       </w:r>
     </w:p>
     <w:p>
@@ -5205,7 +5214,7 @@
           <w:rFonts w:ascii="Times New Roman" w:hAnsi="Times New Roman" w:eastAsia="Times New Roman"/>
           <w:sz w:val="20"/>
         </w:rPr>
-        <w:t>The failure was also load dependent. Frozen-detector block detection fell from 56.25% at 0 N m to 12.50% at 35 N m. Across fault-turn counts, detection ranged only from 15.63% to 32.81% and did not increase monotonically. The full 6 by 8 condition grid shows that many high-load records triggered in only one of eight ordered blocks. The complete fault-turn-by-load alarm grid is shown in Fig. 10.</w:t>
+        <w:t>The failure was also load dependent. Frozen-detector block detection fell from 56.25% at 0 N m to 12.50% at 35 N m. Across the six fixed turn-phase conditions, detection ranged from 15.63% to 32.81% and did not increase monotonically. Because turn count and phase are not fully crossed, this pattern is not an identifiable severity trend. The full 6 by 8 condition grid shows that many high-load records triggered in only one of eight ordered blocks. The complete turn-phase-by-load alarm grid is shown in Fig. 10.</w:t>
       </w:r>
     </w:p>
     <w:p>
@@ -5217,8 +5226,8 @@
       <w:r>
         <w:drawing>
           <wp:inline xmlns:a="http://schemas.openxmlformats.org/drawingml/2006/main" xmlns:pic="http://schemas.openxmlformats.org/drawingml/2006/picture">
-            <wp:extent cx="5806440" cy="3465688"/>
-            <wp:docPr id="10" name="Picture 10" descr="Frozen-detector block detection over fault turns and load."/>
+            <wp:extent cx="5806440" cy="3660149"/>
+            <wp:docPr id="10" name="Picture 10" descr="Frozen-detector block detection over fault turns and load; row labels show the fixed fault phase, so turn and phase effects are not separately identifiable."/>
             <wp:cNvGraphicFramePr>
               <a:graphicFrameLocks noChangeAspect="1"/>
             </wp:cNvGraphicFramePr>
@@ -5238,7 +5247,7 @@
                   <pic:spPr>
                     <a:xfrm>
                       <a:off x="0" y="0"/>
-                      <a:ext cx="5806440" cy="3465688"/>
+                      <a:ext cx="5806440" cy="3660149"/>
                     </a:xfrm>
                     <a:prstGeom prst="rect"/>
                   </pic:spPr>
@@ -5266,7 +5275,7 @@
           <w:rFonts w:ascii="Times New Roman" w:hAnsi="Times New Roman" w:eastAsia="Times New Roman"/>
           <w:sz w:val="18"/>
         </w:rPr>
-        <w:t>Frozen-detector block detection over fault turns and load</w:t>
+        <w:t>Frozen-detector block detection over fault turns and load; row labels show the fixed fault phase, so turn and phase effects are not separately identifiable</w:t>
       </w:r>
     </w:p>
     <w:p>
@@ -5590,7 +5599,7 @@
           <w:rFonts w:ascii="Times New Roman" w:hAnsi="Times New Roman" w:eastAsia="Times New Roman"/>
           <w:sz w:val="20"/>
         </w:rPr>
-        <w:t>Six limitations dominate the claims. First, each KAIST motor has only one unique healthy record, so its calibration and later-time evaluation are not independent sessions. Second, all KAIST machines share manufacturer and fixed operating condition. Third, the KAIST target faults were inspected during development and are exploratory. Fourth, the external 48-record grid comes from one physical dual-three-phase motor; record bootstrap quantifies variability across its recorded conditions, not across a population of motors. Fifth, the external shift is compound, so this experiment cannot causally separate topology, sampling rate, controller, speed, and load effects. Sixth, the secondary transient dataset has no independent healthy records; its frozen parser failed, only four of nine 20 kW records passed the repaired baseline gate, and the reported 200 W sensitivity is post-reveal and conditional on one motor.</w:t>
+        <w:t>Seven limitations dominate the claims. First, each KAIST motor has only one unique healthy record, so its calibration and later-time evaluation are not independent sessions. Second, all KAIST machines share manufacturer and fixed operating condition. Third, the KAIST target faults were inspected during development and are exploratory. Fourth, the external 48-record grid comes from one physical dual-three-phase motor; record bootstrap quantifies variability across its recorded conditions, not across a population of motors. Fifth, external fault-turn count and phase are not fully crossed, so their effects cannot be separated. Sixth, the external shift is compound, so this experiment cannot causally separate topology, sampling rate, controller, speed, and load effects. Seventh, the secondary transient dataset has no independent healthy records; its frozen parser failed, only four of nine 20 kW records passed the repaired baseline gate, and the reported 200 W sensitivity is post-reveal and conditional on one motor.</w:t>
       </w:r>
     </w:p>
     <w:p>

</xml_diff>

<commit_message>
Finalize JEET artwork and submission QA
</commit_message>
<xml_diff>
--- a/submission/jeet/Manuscript_Anonymous.docx
+++ b/submission/jeet/Manuscript_Anonymous.docx
@@ -881,7 +881,52 @@
           <w:rFonts w:ascii="Times New Roman" w:hAnsi="Times New Roman" w:eastAsia="Times New Roman"/>
           <w:sz w:val="20"/>
         </w:rPr>
-        <w:t>Each three-phase subsystem receives its own target robust alignment and target covariance. The three KAIST source motors and that target subsystem contribute one covariance each to a four-entity Log-Euclidean mean. Window maxima are first formed within each subsystem and then combined by a system maximum; the same system score is used for calibration. The 48 public fault records remained sealed until the protocol, feature parser, all comparator implementations, environment, healthy calibration scores, and thresholds were captured in hash-addressed commits. All 48 files were then downloaded from the official record, verified against a frozen filename, byte-count, and Message-Digest Algorithm 5 (MD5) manifest, and processed once over the unchanged [12, 36) s interval. The run yielded a complete 6 fault-turn counts by 8 loads grid (384 system blocks). The chronological reveal log and hash-addressed commits are retained as audit evidence.</w:t>
+        <w:t xml:space="preserve">Each three-phase subsystem receives its own target robust alignment and target covariance. The three KAIST source motors and that target subsystem contribute one covariance each to a four-entity Log-Euclidean mean. Window maxima are first formed within each subsystem and then combined by a system maximum; the same system score is used for calibration. The 48 public fault records remained sealed until the protocol, feature parser, all comparator implementations, environment, healthy calibration scores, and thresholds were captured in hash-addressed commits. All 48 files were then downloaded from the official record, verified against a frozen filename, byte-count, and Message-Digest Algorithm 5 (MD5) manifest, and processed once over the unchanged [12, 36) s interval. The run yielded a complete 6 fault-turn counts by 8 loads grid (384 system blocks). The chronological reveal log and hash-addressed commits are retained as audit evidence. This was a prospective repository-based freeze, not a registration in an external preregistration service; the claims therefore use </w:t>
+      </w:r>
+      <w:r>
+        <w:rPr>
+          <w:rFonts w:ascii="Times New Roman" w:hAnsi="Times New Roman" w:eastAsia="Times New Roman"/>
+          <w:i/>
+          <w:sz w:val="20"/>
+        </w:rPr>
+        <w:t>frozen</w:t>
+      </w:r>
+      <w:r>
+        <w:rPr>
+          <w:rFonts w:ascii="Times New Roman" w:hAnsi="Times New Roman" w:eastAsia="Times New Roman"/>
+          <w:sz w:val="20"/>
+        </w:rPr>
+        <w:t xml:space="preserve"> or </w:t>
+      </w:r>
+      <w:r>
+        <w:rPr>
+          <w:rFonts w:ascii="Times New Roman" w:hAnsi="Times New Roman" w:eastAsia="Times New Roman"/>
+          <w:i/>
+          <w:sz w:val="20"/>
+        </w:rPr>
+        <w:t>pre-reveal</w:t>
+      </w:r>
+      <w:r>
+        <w:rPr>
+          <w:rFonts w:ascii="Times New Roman" w:hAnsi="Times New Roman" w:eastAsia="Times New Roman"/>
+          <w:sz w:val="20"/>
+        </w:rPr>
+        <w:t xml:space="preserve"> rather than </w:t>
+      </w:r>
+      <w:r>
+        <w:rPr>
+          <w:rFonts w:ascii="Times New Roman" w:hAnsi="Times New Roman" w:eastAsia="Times New Roman"/>
+          <w:i/>
+          <w:sz w:val="20"/>
+        </w:rPr>
+        <w:t>preregistered</w:t>
+      </w:r>
+      <w:r>
+        <w:rPr>
+          <w:rFonts w:ascii="Times New Roman" w:hAnsi="Times New Roman" w:eastAsia="Times New Roman"/>
+          <w:sz w:val="20"/>
+        </w:rPr>
+        <w:t>.</w:t>
       </w:r>
     </w:p>
     <w:p>
@@ -2057,8 +2102,8 @@
       <w:r>
         <w:drawing>
           <wp:inline xmlns:a="http://schemas.openxmlformats.org/drawingml/2006/main" xmlns:pic="http://schemas.openxmlformats.org/drawingml/2006/picture">
-            <wp:extent cx="5806440" cy="2587453"/>
-            <wp:docPr id="3" name="Picture 3" descr="Record-level paired detection differences."/>
+            <wp:extent cx="5806440" cy="2403511"/>
+            <wp:docPr id="3" name="Picture 3" descr="Record-level paired detection-rate differences between the Log-Euclidean entity detector and each covariance comparator. Points are mean paired differences and bars are 95% percentile intervals from 10,000 motor-stratified fault-record bootstrap replicates over the 42 available KAIST fault records; positive values favor the Log-Euclidean detector."/>
             <wp:cNvGraphicFramePr>
               <a:graphicFrameLocks noChangeAspect="1"/>
             </wp:cNvGraphicFramePr>
@@ -2078,7 +2123,7 @@
                   <pic:spPr>
                     <a:xfrm>
                       <a:off x="0" y="0"/>
-                      <a:ext cx="5806440" cy="2587453"/>
+                      <a:ext cx="5806440" cy="2403511"/>
                     </a:xfrm>
                     <a:prstGeom prst="rect"/>
                   </pic:spPr>
@@ -2106,7 +2151,7 @@
           <w:rFonts w:ascii="Times New Roman" w:hAnsi="Times New Roman" w:eastAsia="Times New Roman"/>
           <w:sz w:val="18"/>
         </w:rPr>
-        <w:t>Record-level paired detection differences</w:t>
+        <w:t>Record-level paired detection-rate differences between the Log-Euclidean entity detector and each covariance comparator. Points are mean paired differences and bars are 95% percentile intervals from 10,000 motor-stratified fault-record bootstrap replicates over the 42 available KAIST fault records; positive values favor the Log-Euclidean detector</w:t>
       </w:r>
     </w:p>
     <w:p>
@@ -3036,8 +3081,8 @@
       <w:r>
         <w:drawing>
           <wp:inline xmlns:a="http://schemas.openxmlformats.org/drawingml/2006/main" xmlns:pic="http://schemas.openxmlformats.org/drawingml/2006/picture">
-            <wp:extent cx="5806440" cy="2731187"/>
-            <wp:docPr id="4" name="Picture 4" descr="Paired record differences against strong one-class baselines."/>
+            <wp:extent cx="5806440" cy="2614858"/>
+            <wp:docPr id="4" name="Picture 4" descr="Record-level paired detection-rate differences between the proposed detector and the strong one-class baselines. Points are mean paired differences and bars are 95% percentile intervals from 10,000 motor-stratified fault-record bootstrap replicates over the 42 available KAIST fault records; positive values favor the proposed detector. Parenthetical FA labels report false alarms among the 42 later-health blocks."/>
             <wp:cNvGraphicFramePr>
               <a:graphicFrameLocks noChangeAspect="1"/>
             </wp:cNvGraphicFramePr>
@@ -3057,7 +3102,7 @@
                   <pic:spPr>
                     <a:xfrm>
                       <a:off x="0" y="0"/>
-                      <a:ext cx="5806440" cy="2731187"/>
+                      <a:ext cx="5806440" cy="2614858"/>
                     </a:xfrm>
                     <a:prstGeom prst="rect"/>
                   </pic:spPr>
@@ -3085,7 +3130,7 @@
           <w:rFonts w:ascii="Times New Roman" w:hAnsi="Times New Roman" w:eastAsia="Times New Roman"/>
           <w:sz w:val="18"/>
         </w:rPr>
-        <w:t>Paired record differences against strong one-class baselines</w:t>
+        <w:t>Record-level paired detection-rate differences between the proposed detector and the strong one-class baselines. Points are mean paired differences and bars are 95% percentile intervals from 10,000 motor-stratified fault-record bootstrap replicates over the 42 available KAIST fault records; positive values favor the proposed detector. Parenthetical FA labels report false alarms among the 42 later-health blocks</w:t>
       </w:r>
     </w:p>
     <w:p>
@@ -5056,8 +5101,8 @@
       <w:r>
         <w:drawing>
           <wp:inline xmlns:a="http://schemas.openxmlformats.org/drawingml/2006/main" xmlns:pic="http://schemas.openxmlformats.org/drawingml/2006/picture">
-            <wp:extent cx="5806440" cy="3252623"/>
-            <wp:docPr id="8" name="Picture 8" descr="External fault detection, healthy false alarms, and the predeclared H1 decision."/>
+            <wp:extent cx="5806440" cy="2909987"/>
+            <wp:docPr id="8" name="Picture 8" descr="External fault detection, held-out-health false alarms, and the predeclared H1 decision on one dual-three-phase PMSM. Panel (a) shows block detection with turn-stratified record-bootstrap intervals over 48 fault records and 384 ordered blocks. Panel (b) shows pooled false-alarm rates with descriptive 95% Wilson intervals over four held-out healthy loads and 32 blocks, maximum load-specific false-alarm rates, and the H1 limits of 12% for the pooled Wilson upper bound and 15% for the maximum-load rate. Gold marks the observed detection leader and hatched blue marks the frozen proposed detector; intervals are descriptive at the recorded-condition level."/>
             <wp:cNvGraphicFramePr>
               <a:graphicFrameLocks noChangeAspect="1"/>
             </wp:cNvGraphicFramePr>
@@ -5077,7 +5122,7 @@
                   <pic:spPr>
                     <a:xfrm>
                       <a:off x="0" y="0"/>
-                      <a:ext cx="5806440" cy="3252623"/>
+                      <a:ext cx="5806440" cy="2909987"/>
                     </a:xfrm>
                     <a:prstGeom prst="rect"/>
                   </pic:spPr>
@@ -5105,7 +5150,7 @@
           <w:rFonts w:ascii="Times New Roman" w:hAnsi="Times New Roman" w:eastAsia="Times New Roman"/>
           <w:sz w:val="18"/>
         </w:rPr>
-        <w:t>External fault detection, healthy false alarms, and the predeclared H1 decision</w:t>
+        <w:t>External fault detection, held-out-health false alarms, and the predeclared H1 decision on one dual-three-phase PMSM. Panel (a) shows block detection with turn-stratified record-bootstrap intervals over 48 fault records and 384 ordered blocks. Panel (b) shows pooled false-alarm rates with descriptive 95% Wilson intervals over four held-out healthy loads and 32 blocks, maximum load-specific false-alarm rates, and the H1 limits of 12% for the pooled Wilson upper bound and 15% for the maximum-load rate. Gold marks the observed detection leader and hatched blue marks the frozen proposed detector; intervals are descriptive at the recorded-condition level</w:t>
       </w:r>
     </w:p>
     <w:p>
@@ -5156,8 +5201,8 @@
       <w:r>
         <w:drawing>
           <wp:inline xmlns:a="http://schemas.openxmlformats.org/drawingml/2006/main" xmlns:pic="http://schemas.openxmlformats.org/drawingml/2006/picture">
-            <wp:extent cx="5806440" cy="3733981"/>
-            <wp:docPr id="9" name="Picture 9" descr="Threshold-normalized score and alarm drift over the acceleration trajectory."/>
+            <wp:extent cx="5806440" cy="3862071"/>
+            <wp:docPr id="9" name="Picture 9" descr="Frozen Log-Euclidean score and alarm drift over eight ordered 3 s external analysis blocks. Panel (a) shows the median and interquartile range of threshold-normalized scores on a logarithmic scale for 48 fault records and four held-out healthy records per block; the top axis gives approximate median speed. Panel (b) shows empirical block alarm rates. Blocks are ordered operating points rather than independent repeats, and the score and alarm drift are therefore confounded with the rise from approximately 218 to 2,214 rpm."/>
             <wp:cNvGraphicFramePr>
               <a:graphicFrameLocks noChangeAspect="1"/>
             </wp:cNvGraphicFramePr>
@@ -5177,7 +5222,7 @@
                   <pic:spPr>
                     <a:xfrm>
                       <a:off x="0" y="0"/>
-                      <a:ext cx="5806440" cy="3733981"/>
+                      <a:ext cx="5806440" cy="3862071"/>
                     </a:xfrm>
                     <a:prstGeom prst="rect"/>
                   </pic:spPr>
@@ -5205,7 +5250,7 @@
           <w:rFonts w:ascii="Times New Roman" w:hAnsi="Times New Roman" w:eastAsia="Times New Roman"/>
           <w:sz w:val="18"/>
         </w:rPr>
-        <w:t>Threshold-normalized score and alarm drift over the acceleration trajectory</w:t>
+        <w:t>Frozen Log-Euclidean score and alarm drift over eight ordered 3 s external analysis blocks. Panel (a) shows the median and interquartile range of threshold-normalized scores on a logarithmic scale for 48 fault records and four held-out healthy records per block; the top axis gives approximate median speed. Panel (b) shows empirical block alarm rates. Blocks are ordered operating points rather than independent repeats, and the score and alarm drift are therefore confounded with the rise from approximately 218 to 2,214 rpm</w:t>
       </w:r>
     </w:p>
     <w:p>
@@ -5226,8 +5271,8 @@
       <w:r>
         <w:drawing>
           <wp:inline xmlns:a="http://schemas.openxmlformats.org/drawingml/2006/main" xmlns:pic="http://schemas.openxmlformats.org/drawingml/2006/picture">
-            <wp:extent cx="5806440" cy="3660149"/>
-            <wp:docPr id="10" name="Picture 10" descr="Frozen-detector block detection over fault turns and load; row labels show the fixed fault phase, so turn and phase effects are not separately identifiable."/>
+            <wp:extent cx="5806440" cy="2757499"/>
+            <wp:docPr id="10" name="Picture 10" descr="Frozen-detector alarm fraction across six fixed turn-phase conditions and eight loads on the external motor. Each cell is the fraction of eight ordered 3 s blocks alarmed within one record, so 12.5% represents one of eight blocks. Phase is fixed by turn count (U: 1, 3, 5, and 6; V: 2 and 4), so turn and phase effects are not separately identifiable; blocks within a record are ordered operating points rather than independent repetitions."/>
             <wp:cNvGraphicFramePr>
               <a:graphicFrameLocks noChangeAspect="1"/>
             </wp:cNvGraphicFramePr>
@@ -5247,7 +5292,7 @@
                   <pic:spPr>
                     <a:xfrm>
                       <a:off x="0" y="0"/>
-                      <a:ext cx="5806440" cy="3660149"/>
+                      <a:ext cx="5806440" cy="2757499"/>
                     </a:xfrm>
                     <a:prstGeom prst="rect"/>
                   </pic:spPr>
@@ -5275,7 +5320,7 @@
           <w:rFonts w:ascii="Times New Roman" w:hAnsi="Times New Roman" w:eastAsia="Times New Roman"/>
           <w:sz w:val="18"/>
         </w:rPr>
-        <w:t>Frozen-detector block detection over fault turns and load; row labels show the fixed fault phase, so turn and phase effects are not separately identifiable</w:t>
+        <w:t>Frozen-detector alarm fraction across six fixed turn-phase conditions and eight loads on the external motor. Each cell is the fraction of eight ordered 3 s blocks alarmed within one record, so 12.5% represents one of eight blocks. Phase is fixed by turn count (U: 1, 3, 5, and 6; V: 2 and 4), so turn and phase effects are not separately identifiable; blocks within a record are ordered operating points rather than independent repetitions</w:t>
       </w:r>
     </w:p>
     <w:p>
@@ -5410,8 +5455,8 @@
       <w:r>
         <w:drawing>
           <wp:inline xmlns:a="http://schemas.openxmlformats.org/drawingml/2006/main" xmlns:pic="http://schemas.openxmlformats.org/drawingml/2006/picture">
-            <wp:extent cx="5806440" cy="2806905"/>
-            <wp:docPr id="11" name="Picture 11" descr="Post-reveal single-feature discrimination versus frozen-score contribution."/>
+            <wp:extent cx="5806440" cy="2766587"/>
+            <wp:docPr id="11" name="Picture 11" descr="Post-reveal single-feature discrimination versus frozen-score contribution on one external motor. Panel (a) shows direction-free AUROC and the absolute matched standardized difference for record-subsystem-block means at the four loads with held-out health; each healthy condition is reused across six fault-turn comparisons. Panel (b) shows winning-window absolute Mahalanobis contribution shares for all fault records and held-out health, using the symmetric cross-term split defined in Section 6.9. The analysis is descriptive, no detector was refit, and no threshold was changed."/>
             <wp:cNvGraphicFramePr>
               <a:graphicFrameLocks noChangeAspect="1"/>
             </wp:cNvGraphicFramePr>
@@ -5431,7 +5476,7 @@
                   <pic:spPr>
                     <a:xfrm>
                       <a:off x="0" y="0"/>
-                      <a:ext cx="5806440" cy="2806905"/>
+                      <a:ext cx="5806440" cy="2766587"/>
                     </a:xfrm>
                     <a:prstGeom prst="rect"/>
                   </pic:spPr>
@@ -5459,7 +5504,7 @@
           <w:rFonts w:ascii="Times New Roman" w:hAnsi="Times New Roman" w:eastAsia="Times New Roman"/>
           <w:sz w:val="18"/>
         </w:rPr>
-        <w:t>Post-reveal single-feature discrimination versus frozen-score contribution</w:t>
+        <w:t>Post-reveal single-feature discrimination versus frozen-score contribution on one external motor. Panel (a) shows direction-free AUROC and the absolute matched standardized difference for record-subsystem-block means at the four loads with held-out health; each healthy condition is reused across six fault-turn comparisons. Panel (b) shows winning-window absolute Mahalanobis contribution shares for all fault records and held-out health, using the symmetric cross-term split defined in Section 6.9. The analysis is descriptive, no detector was refit, and no threshold was changed</w:t>
       </w:r>
     </w:p>
     <w:p>

</xml_diff>

<commit_message>
Strengthen engineering scope and submission handoff
</commit_message>
<xml_diff>
--- a/submission/jeet/Manuscript_Anonymous.docx
+++ b/submission/jeet/Manuscript_Anonymous.docx
@@ -32,7 +32,7 @@
           <w:rFonts w:ascii="Times New Roman" w:hAnsi="Times New Roman" w:eastAsia="Times New Roman"/>
           <w:sz w:val="20"/>
         </w:rPr>
-        <w:t>High within-dataset accuracy does not establish that a healthy-only stator-fault detector will transfer to a different permanent-magnet synchronous motor (PMSM). We evaluate eleven healthy-only detectors in a primary two-dataset analysis with motor/file separation, chronological target-health splits, 3 s alarm blocks, and no target-fault labels for fitting or thresholding. An exploratory study used three same-manufacturer 1.0, 1.5, and 3.0 kW PMSMs at fixed speed and load. The motor-balanced Log-Euclidean detector produced 0/42 healthy alarms and 95.71% fault-block detection. A motor-balanced Isolation Forest produced 0/42 and 96.07%, without a resolved difference. We froze the pipeline and health threshold before revealing 48 fault records from an independent dual-three-phase PMSM accelerated at eight loads. The frozen detector failed its empirical health gate (1/32 alarms; descriptive 95% Wilson upper confidence bound 15.74% versus a 12% limit), detected 25.00% of fault blocks (95% turn-stratified record-bootstrap interval 21.09-29.43%), and attained an area under the receiver-operating-characteristic curve (AUROC) of 0.635. Target-only Minimum Covariance Determinant produced 0/32 healthy alarms, 70.05% detection (65.36-75.26%), and AUROC 0.927. The frozen detector alarmed on none of 48 records in the first three blocks but on all 48 in the final block; detection also fell from 56.25% at 0 N m to 12.50% at 35 N m. Conditional on this external motor, the results reveal a ranking reversal, acceleration-aligned alarm drift, and source-augmented variants that underperformed target-only counterparts. This audit-first protocol demonstrates why same-dataset scores and record-any alarms can overstate deployability under compound shift.</w:t>
+        <w:t>High within-dataset accuracy does not establish that a healthy-only stator-fault detector will transfer to a different permanent-magnet synchronous motor (PMSM). We evaluate eleven healthy-only detectors in a primary two-dataset analysis with motor/file separation, chronological target-health splits, 3 s alarm blocks, and no target-fault labels for fitting or thresholding. An exploratory study used three same-manufacturer 1.0, 1.5, and 3.0 kW PMSMs at fixed speed and load. The motor-balanced Log-Euclidean detector produced 0/42 healthy alarms and 95.71% fault-block detection. A motor-balanced Isolation Forest produced 0/42 and 96.07%, without a resolved difference. We froze the pipeline and health threshold before revealing 48 fault records from a 30.16-kW dual-three-phase PMSM accelerated across eight loads. The frozen detector failed its empirical health gate (1/32 alarms; descriptive 95% Wilson upper confidence bound 15.74% versus a 12% limit), detected 25.00% of fault blocks (95% turn-stratified record-bootstrap interval 21.09-29.43%), and attained an area under the receiver-operating-characteristic curve (AUROC) of 0.635. Target-only Minimum Covariance Determinant produced 0/32 healthy alarms, 70.05% detection (65.36-75.26%), and AUROC 0.927. The frozen detector alarmed on none of 48 records in the first three blocks but on all 48 in the final block; detection also fell from 56.25% at 0 N m to 12.50% at 35 N m. Conditional on this external motor, the results reveal a ranking reversal, acceleration-aligned alarm drift, and source-augmented variants that underperformed target-only counterparts. This audit-first protocol demonstrates why same-dataset scores and record-any alarms can overstate deployability under compound shift.</w:t>
       </w:r>
     </w:p>
     <w:p>
@@ -872,7 +872,7 @@
           <w:rFonts w:ascii="Times New Roman" w:hAnsi="Times New Roman" w:eastAsia="Times New Roman"/>
           <w:sz w:val="20"/>
         </w:rPr>
-        <w:t>The external target is a public dual-three-phase PMSM with winding taps, two measured three-phase current subsystems, and externally emulated interturn short circuits [32, 33]. Its eight healthy records are acceleration sweeps at 0-35 Nm, not steady 5000 rpm records. A health-only audit fixed the common analysis interval to [12, 36) s before any external fault file was downloaded. The 0 Nm record supplies four 3 s target-adaptation blocks; the independent 10, 20, and 30 Nm records supply 24 system-calibration blocks; and the 5, 15, 25, and 35 Nm records supply 32 held-out healthy blocks.</w:t>
+        <w:t>The external target is a public dual-three-phase PMSM with winding taps, two measured three-phase current subsystems, and externally emulated interturn short circuits [32, 33]. The cited machine description reports a custom 30.16 kW design with a 200 V DC link, 107 A maximum continuous current, ten pole pairs, and 8000 rpm nominal speed. Its eight healthy records are acceleration sweeps at 0-35 N m, not steady 5000 rpm records. A health-only audit fixed the common analysis interval to [12, 36) s before any external fault file was downloaded. The 0 N m record supplies four 3 s target-adaptation blocks; the independent 10, 20, and 30 N m records supply 24 system-calibration blocks; and the 5, 15, 25, and 35 N m records supply 32 held-out healthy blocks.</w:t>
       </w:r>
     </w:p>
     <w:p>
@@ -5635,6 +5635,15 @@
           <w:rFonts w:ascii="Times New Roman" w:hAnsi="Times New Roman" w:eastAsia="Times New Roman"/>
           <w:sz w:val="20"/>
         </w:rPr>
+        <w:t>All analyses were executed offline. Feature-extraction latency, memory footprint, and embedded numerical stability were not benchmarked, so the 0.2 s window length and 3 s alarm block do not by themselves establish real-time feasibility.</w:t>
+      </w:r>
+    </w:p>
+    <w:p>
+      <w:r>
+        <w:rPr>
+          <w:rFonts w:ascii="Times New Roman" w:hAnsi="Times New Roman" w:eastAsia="Times New Roman"/>
+          <w:sz w:val="20"/>
+        </w:rPr>
         <w:t>The secondary transient audit adds a different failure mode: a validation can fail before model comparison if file-time semantics or available prefault baselines do not meet the frozen contract. Reconstructing documented implicit time made analysis possible, but it did not restore confirmatory status. The 200 W null sensitivity is consistent with cross-record healthy heterogeneity overwhelming the short post-onset change under these thresholds; because this interpretation followed reveal, it is a design diagnostic rather than evidence for a revised detector.</w:t>
       </w:r>
     </w:p>

</xml_diff>